<commit_message>
updating based on sop
</commit_message>
<xml_diff>
--- a/templates/mj-equipment-lifecycle-report-template.docx
+++ b/templates/mj-equipment-lifecycle-report-template.docx
@@ -27,7 +27,7 @@
           <w:sz w:val="20"/>
           <w:szCs w:val="20"/>
         </w:rPr>
-        <w:t xml:space="preserve">Format No.: SOP/DP/QA/0XX/F01-R00</w:t>
+        <w:t xml:space="preserve">Format No.: SOP/DP/QA/014/F22-R00</w:t>
       </w:r>
     </w:p>
     <w:tbl>
@@ -3398,7 +3398,7 @@
         <w:sz w:val="24"/>
         <w:szCs w:val="24"/>
       </w:rPr>
-      <w:t>/DP/QA/0XX/F01-R00</w:t>
+      <w:t>/DP/QA/014/F22-R00</w:t>
     </w:r>
     <w:r>
       <w:rPr>
@@ -3499,7 +3499,7 @@
         <w:sz w:val="24"/>
         <w:szCs w:val="24"/>
       </w:rPr>
-      <w:t>Reference SOP No.: SOP/DP/QA/0XX</w:t>
+      <w:t>Reference SOP No.: SOP/DP/QA/014</w:t>
     </w:r>
     <w:r>
       <w:rPr>
@@ -3872,7 +3872,7 @@
                     <w:sz w:val="18"/>
                     <w:szCs w:val="18"/>
                   </w:rPr>
-                  <w:t xml:space="preserve">Format No.: SOP/DP/QA/0XX/F01-R00</w:t>
+                  <w:t xml:space="preserve">Format No.: SOP/DP/QA/014/F22-R00</w:t>
                 </w:r>
               </w:p>
             </w:tc>

</xml_diff>

<commit_message>
updating template based on sop
</commit_message>
<xml_diff>
--- a/templates/mj-equipment-lifecycle-report-template.docx
+++ b/templates/mj-equipment-lifecycle-report-template.docx
@@ -91,6 +91,88 @@
                 <w:szCs w:val="20"/>
               </w:rPr>
               <w:t xml:space="preserve">{equipmentName}</w:t>
+            </w:r>
+          </w:p>
+        </w:tc>
+      </w:tr>
+      <w:tr>
+        <w:tc>
+          <w:tcPr>
+            <w:tcW w:w="4200" w:type="dxa"/>
+            <w:shd w:val="clear" w:color="auto" w:fill="E7E6E6"/>
+            <w:vAlign w:val="center"/>
+          </w:tcPr>
+          <w:p>
+            <w:pPr>
+              <w:spacing w:before="40" w:after="40"/>
+            </w:pPr>
+            <w:r>
+              <w:rPr>
+                <w:b/>
+                <w:bCs/>
+                <w:sz w:val="20"/>
+                <w:szCs w:val="20"/>
+              </w:rPr>
+              <w:t xml:space="preserve">Equipment Make</w:t>
+            </w:r>
+          </w:p>
+        </w:tc>
+        <w:tc>
+          <w:tcPr>
+            <w:tcW w:w="6200" w:type="dxa"/>
+            <w:vAlign w:val="center"/>
+          </w:tcPr>
+          <w:p>
+            <w:pPr>
+              <w:spacing w:before="40" w:after="40"/>
+            </w:pPr>
+            <w:r>
+              <w:rPr>
+                <w:sz w:val="20"/>
+                <w:szCs w:val="20"/>
+              </w:rPr>
+              <w:t xml:space="preserve">{equipmentMake}</w:t>
+            </w:r>
+          </w:p>
+        </w:tc>
+      </w:tr>
+      <w:tr>
+        <w:tc>
+          <w:tcPr>
+            <w:tcW w:w="4200" w:type="dxa"/>
+            <w:shd w:val="clear" w:color="auto" w:fill="E7E6E6"/>
+            <w:vAlign w:val="center"/>
+          </w:tcPr>
+          <w:p>
+            <w:pPr>
+              <w:spacing w:before="40" w:after="40"/>
+            </w:pPr>
+            <w:r>
+              <w:rPr>
+                <w:b/>
+                <w:bCs/>
+                <w:sz w:val="20"/>
+                <w:szCs w:val="20"/>
+              </w:rPr>
+              <w:t xml:space="preserve">Equipment Model</w:t>
+            </w:r>
+          </w:p>
+        </w:tc>
+        <w:tc>
+          <w:tcPr>
+            <w:tcW w:w="6200" w:type="dxa"/>
+            <w:vAlign w:val="center"/>
+          </w:tcPr>
+          <w:p>
+            <w:pPr>
+              <w:spacing w:before="40" w:after="40"/>
+            </w:pPr>
+            <w:r>
+              <w:rPr>
+                <w:sz w:val="20"/>
+                <w:szCs w:val="20"/>
+              </w:rPr>
+              <w:t xml:space="preserve">{equipmentModel}</w:t>
             </w:r>
           </w:p>
         </w:tc>
@@ -931,7 +1013,7 @@
                 <w:sz w:val="20"/>
                 <w:szCs w:val="20"/>
               </w:rPr>
-              <w:t xml:space="preserve">1</w:t>
+              <w:t xml:space="preserve">1.0</w:t>
             </w:r>
           </w:p>
         </w:tc>
@@ -949,7 +1031,7 @@
                 <w:sz w:val="20"/>
                 <w:szCs w:val="20"/>
               </w:rPr>
-              <w:t xml:space="preserve">Objective</w:t>
+              <w:t xml:space="preserve">Purpose</w:t>
             </w:r>
           </w:p>
         </w:tc>
@@ -980,7 +1062,7 @@
                 <w:sz w:val="20"/>
                 <w:szCs w:val="20"/>
               </w:rPr>
-              <w:t xml:space="preserve">2</w:t>
+              <w:t xml:space="preserve">2.0</w:t>
             </w:r>
           </w:p>
         </w:tc>
@@ -1029,7 +1111,7 @@
                 <w:sz w:val="20"/>
                 <w:szCs w:val="20"/>
               </w:rPr>
-              <w:t xml:space="preserve">3</w:t>
+              <w:t xml:space="preserve">3.0</w:t>
             </w:r>
           </w:p>
         </w:tc>
@@ -1047,7 +1129,7 @@
                 <w:sz w:val="20"/>
                 <w:szCs w:val="20"/>
               </w:rPr>
-              <w:t xml:space="preserve">Responsibilities</w:t>
+              <w:t xml:space="preserve">Observations and Results</w:t>
             </w:r>
           </w:p>
         </w:tc>
@@ -1078,7 +1160,7 @@
                 <w:sz w:val="20"/>
                 <w:szCs w:val="20"/>
               </w:rPr>
-              <w:t xml:space="preserve">4</w:t>
+              <w:t xml:space="preserve">3.1</w:t>
             </w:r>
           </w:p>
         </w:tc>
@@ -1096,7 +1178,7 @@
                 <w:sz w:val="20"/>
                 <w:szCs w:val="20"/>
               </w:rPr>
-              <w:t xml:space="preserve">Equipment and System Description</w:t>
+              <w:t xml:space="preserve">Responsibility</w:t>
             </w:r>
           </w:p>
         </w:tc>
@@ -1127,7 +1209,7 @@
                 <w:sz w:val="20"/>
                 <w:szCs w:val="20"/>
               </w:rPr>
-              <w:t xml:space="preserve">5</w:t>
+              <w:t xml:space="preserve">3.2</w:t>
             </w:r>
           </w:p>
         </w:tc>
@@ -1145,7 +1227,7 @@
                 <w:sz w:val="20"/>
                 <w:szCs w:val="20"/>
               </w:rPr>
-              <w:t xml:space="preserve">Qualification and Periodic Re-Qualification History</w:t>
+              <w:t xml:space="preserve">Abbreviations</w:t>
             </w:r>
           </w:p>
         </w:tc>
@@ -1176,7 +1258,7 @@
                 <w:sz w:val="20"/>
                 <w:szCs w:val="20"/>
               </w:rPr>
-              <w:t xml:space="preserve">6</w:t>
+              <w:t xml:space="preserve">3.3</w:t>
             </w:r>
           </w:p>
         </w:tc>
@@ -1194,7 +1276,7 @@
                 <w:sz w:val="20"/>
                 <w:szCs w:val="20"/>
               </w:rPr>
-              <w:t xml:space="preserve">Media Fill / Aseptic Process Simulation</w:t>
+              <w:t xml:space="preserve">Equipment and System Description</w:t>
             </w:r>
           </w:p>
         </w:tc>
@@ -1225,7 +1307,7 @@
                 <w:sz w:val="20"/>
                 <w:szCs w:val="20"/>
               </w:rPr>
-              <w:t xml:space="preserve">7</w:t>
+              <w:t xml:space="preserve">3.4</w:t>
             </w:r>
           </w:p>
         </w:tc>
@@ -1243,7 +1325,7 @@
                 <w:sz w:val="20"/>
                 <w:szCs w:val="20"/>
               </w:rPr>
-              <w:t xml:space="preserve">Monitoring</w:t>
+              <w:t xml:space="preserve">Qualification and Periodic Re-Qualification History</w:t>
             </w:r>
           </w:p>
         </w:tc>
@@ -1274,7 +1356,7 @@
                 <w:sz w:val="20"/>
                 <w:szCs w:val="20"/>
               </w:rPr>
-              <w:t xml:space="preserve">8</w:t>
+              <w:t xml:space="preserve">3.5</w:t>
             </w:r>
           </w:p>
         </w:tc>
@@ -1292,7 +1374,7 @@
                 <w:sz w:val="20"/>
                 <w:szCs w:val="20"/>
               </w:rPr>
-              <w:t xml:space="preserve">Calibration of Associated Instruments</w:t>
+              <w:t xml:space="preserve">Media Fill / Aseptic Process Simulation</w:t>
             </w:r>
           </w:p>
         </w:tc>
@@ -1323,7 +1405,7 @@
                 <w:sz w:val="20"/>
                 <w:szCs w:val="20"/>
               </w:rPr>
-              <w:t xml:space="preserve">9</w:t>
+              <w:t xml:space="preserve">3.6</w:t>
             </w:r>
           </w:p>
         </w:tc>
@@ -1341,7 +1423,7 @@
                 <w:sz w:val="20"/>
                 <w:szCs w:val="20"/>
               </w:rPr>
-              <w:t xml:space="preserve">Preventive Maintenance</w:t>
+              <w:t xml:space="preserve">Monitoring</w:t>
             </w:r>
           </w:p>
         </w:tc>
@@ -1372,7 +1454,7 @@
                 <w:sz w:val="20"/>
                 <w:szCs w:val="20"/>
               </w:rPr>
-              <w:t xml:space="preserve">10</w:t>
+              <w:t xml:space="preserve">3.7</w:t>
             </w:r>
           </w:p>
         </w:tc>
@@ -1390,7 +1472,7 @@
                 <w:sz w:val="20"/>
                 <w:szCs w:val="20"/>
               </w:rPr>
-              <w:t xml:space="preserve">Breakdowns and Trends</w:t>
+              <w:t xml:space="preserve">Calibration of Associated Instruments</w:t>
             </w:r>
           </w:p>
         </w:tc>
@@ -1421,7 +1503,7 @@
                 <w:sz w:val="20"/>
                 <w:szCs w:val="20"/>
               </w:rPr>
-              <w:t xml:space="preserve">11</w:t>
+              <w:t xml:space="preserve">3.8</w:t>
             </w:r>
           </w:p>
         </w:tc>
@@ -1439,7 +1521,7 @@
                 <w:sz w:val="20"/>
                 <w:szCs w:val="20"/>
               </w:rPr>
-              <w:t xml:space="preserve">QMS Records since Last Periodic Re-Qualification</w:t>
+              <w:t xml:space="preserve">Preventive Maintenance</w:t>
             </w:r>
           </w:p>
         </w:tc>
@@ -1470,7 +1552,7 @@
                 <w:sz w:val="20"/>
                 <w:szCs w:val="20"/>
               </w:rPr>
-              <w:t xml:space="preserve">12</w:t>
+              <w:t xml:space="preserve">3.9</w:t>
             </w:r>
           </w:p>
         </w:tc>
@@ -1488,7 +1570,7 @@
                 <w:sz w:val="20"/>
                 <w:szCs w:val="20"/>
               </w:rPr>
-              <w:t xml:space="preserve">Alarm Trends</w:t>
+              <w:t xml:space="preserve">Breakdowns and Trends</w:t>
             </w:r>
           </w:p>
         </w:tc>
@@ -1519,7 +1601,7 @@
                 <w:sz w:val="20"/>
                 <w:szCs w:val="20"/>
               </w:rPr>
-              <w:t xml:space="preserve">13</w:t>
+              <w:t xml:space="preserve">3.10</w:t>
             </w:r>
           </w:p>
         </w:tc>
@@ -1537,7 +1619,7 @@
                 <w:sz w:val="20"/>
                 <w:szCs w:val="20"/>
               </w:rPr>
-              <w:t xml:space="preserve">Access Control and Audit Trail Review</w:t>
+              <w:t xml:space="preserve">QMS Records since Last Periodic Re-Qualification</w:t>
             </w:r>
           </w:p>
         </w:tc>
@@ -1568,7 +1650,7 @@
                 <w:sz w:val="20"/>
                 <w:szCs w:val="20"/>
               </w:rPr>
-              <w:t xml:space="preserve">14</w:t>
+              <w:t xml:space="preserve">3.11</w:t>
             </w:r>
           </w:p>
         </w:tc>
@@ -1586,7 +1668,7 @@
                 <w:sz w:val="20"/>
                 <w:szCs w:val="20"/>
               </w:rPr>
-              <w:t xml:space="preserve">Computerized System Validation Status</w:t>
+              <w:t xml:space="preserve">Alarm Trends</w:t>
             </w:r>
           </w:p>
         </w:tc>
@@ -1617,7 +1699,7 @@
                 <w:sz w:val="20"/>
                 <w:szCs w:val="20"/>
               </w:rPr>
-              <w:t xml:space="preserve">15</w:t>
+              <w:t xml:space="preserve">3.12</w:t>
             </w:r>
           </w:p>
         </w:tc>
@@ -1635,7 +1717,7 @@
                 <w:sz w:val="20"/>
                 <w:szCs w:val="20"/>
               </w:rPr>
-              <w:t xml:space="preserve">Conclusion and Recommendation</w:t>
+              <w:t xml:space="preserve">Access Control</w:t>
             </w:r>
           </w:p>
         </w:tc>
@@ -1666,7 +1748,7 @@
                 <w:sz w:val="20"/>
                 <w:szCs w:val="20"/>
               </w:rPr>
-              <w:t xml:space="preserve">16</w:t>
+              <w:t xml:space="preserve">3.13</w:t>
             </w:r>
           </w:p>
         </w:tc>
@@ -1684,7 +1766,7 @@
                 <w:sz w:val="20"/>
                 <w:szCs w:val="20"/>
               </w:rPr>
-              <w:t xml:space="preserve">Attachments</w:t>
+              <w:t xml:space="preserve">Audit Trail Review</w:t>
             </w:r>
           </w:p>
         </w:tc>
@@ -1715,7 +1797,7 @@
                 <w:sz w:val="20"/>
                 <w:szCs w:val="20"/>
               </w:rPr>
-              <w:t xml:space="preserve">A</w:t>
+              <w:t xml:space="preserve">3.14</w:t>
             </w:r>
           </w:p>
         </w:tc>
@@ -1733,7 +1815,7 @@
                 <w:sz w:val="20"/>
                 <w:szCs w:val="20"/>
               </w:rPr>
-              <w:t xml:space="preserve">Revision History</w:t>
+              <w:t xml:space="preserve">Computerized System Validation Status</w:t>
             </w:r>
           </w:p>
         </w:tc>
@@ -1764,7 +1846,7 @@
                 <w:sz w:val="20"/>
                 <w:szCs w:val="20"/>
               </w:rPr>
-              <w:t xml:space="preserve">B</w:t>
+              <w:t xml:space="preserve">4.0</w:t>
             </w:r>
           </w:p>
         </w:tc>
@@ -1782,7 +1864,252 @@
                 <w:sz w:val="20"/>
                 <w:szCs w:val="20"/>
               </w:rPr>
-              <w:t xml:space="preserve">Review and Approval</w:t>
+              <w:t xml:space="preserve">Discrepancy / Deviations (If Any)</w:t>
+            </w:r>
+          </w:p>
+        </w:tc>
+        <w:tc>
+          <w:tcPr>
+            <w:tcW w:w="2000" w:type="dxa"/>
+            <w:vAlign w:val="center"/>
+          </w:tcPr>
+          <w:p>
+            <w:pPr>
+              <w:spacing w:before="40" w:after="40"/>
+            </w:pPr>
+          </w:p>
+        </w:tc>
+      </w:tr>
+      <w:tr>
+        <w:tc>
+          <w:tcPr>
+            <w:tcW w:w="900" w:type="dxa"/>
+            <w:vAlign w:val="center"/>
+          </w:tcPr>
+          <w:p>
+            <w:pPr>
+              <w:spacing w:before="40" w:after="40"/>
+            </w:pPr>
+            <w:r>
+              <w:rPr>
+                <w:sz w:val="20"/>
+                <w:szCs w:val="20"/>
+              </w:rPr>
+              <w:t xml:space="preserve">5.0</w:t>
+            </w:r>
+          </w:p>
+        </w:tc>
+        <w:tc>
+          <w:tcPr>
+            <w:tcW w:w="7500" w:type="dxa"/>
+            <w:vAlign w:val="center"/>
+          </w:tcPr>
+          <w:p>
+            <w:pPr>
+              <w:spacing w:before="40" w:after="40"/>
+            </w:pPr>
+            <w:r>
+              <w:rPr>
+                <w:sz w:val="20"/>
+                <w:szCs w:val="20"/>
+              </w:rPr>
+              <w:t xml:space="preserve">Summary and Conclusion</w:t>
+            </w:r>
+          </w:p>
+        </w:tc>
+        <w:tc>
+          <w:tcPr>
+            <w:tcW w:w="2000" w:type="dxa"/>
+            <w:vAlign w:val="center"/>
+          </w:tcPr>
+          <w:p>
+            <w:pPr>
+              <w:spacing w:before="40" w:after="40"/>
+            </w:pPr>
+          </w:p>
+        </w:tc>
+      </w:tr>
+      <w:tr>
+        <w:tc>
+          <w:tcPr>
+            <w:tcW w:w="900" w:type="dxa"/>
+            <w:vAlign w:val="center"/>
+          </w:tcPr>
+          <w:p>
+            <w:pPr>
+              <w:spacing w:before="40" w:after="40"/>
+            </w:pPr>
+            <w:r>
+              <w:rPr>
+                <w:sz w:val="20"/>
+                <w:szCs w:val="20"/>
+              </w:rPr>
+              <w:t xml:space="preserve">6.0</w:t>
+            </w:r>
+          </w:p>
+        </w:tc>
+        <w:tc>
+          <w:tcPr>
+            <w:tcW w:w="7500" w:type="dxa"/>
+            <w:vAlign w:val="center"/>
+          </w:tcPr>
+          <w:p>
+            <w:pPr>
+              <w:spacing w:before="40" w:after="40"/>
+            </w:pPr>
+            <w:r>
+              <w:rPr>
+                <w:sz w:val="20"/>
+                <w:szCs w:val="20"/>
+              </w:rPr>
+              <w:t xml:space="preserve">Recommendation</w:t>
+            </w:r>
+          </w:p>
+        </w:tc>
+        <w:tc>
+          <w:tcPr>
+            <w:tcW w:w="2000" w:type="dxa"/>
+            <w:vAlign w:val="center"/>
+          </w:tcPr>
+          <w:p>
+            <w:pPr>
+              <w:spacing w:before="40" w:after="40"/>
+            </w:pPr>
+          </w:p>
+        </w:tc>
+      </w:tr>
+      <w:tr>
+        <w:tc>
+          <w:tcPr>
+            <w:tcW w:w="900" w:type="dxa"/>
+            <w:vAlign w:val="center"/>
+          </w:tcPr>
+          <w:p>
+            <w:pPr>
+              <w:spacing w:before="40" w:after="40"/>
+            </w:pPr>
+            <w:r>
+              <w:rPr>
+                <w:sz w:val="20"/>
+                <w:szCs w:val="20"/>
+              </w:rPr>
+              <w:t xml:space="preserve">7.0</w:t>
+            </w:r>
+          </w:p>
+        </w:tc>
+        <w:tc>
+          <w:tcPr>
+            <w:tcW w:w="7500" w:type="dxa"/>
+            <w:vAlign w:val="center"/>
+          </w:tcPr>
+          <w:p>
+            <w:pPr>
+              <w:spacing w:before="40" w:after="40"/>
+            </w:pPr>
+            <w:r>
+              <w:rPr>
+                <w:sz w:val="20"/>
+                <w:szCs w:val="20"/>
+              </w:rPr>
+              <w:t xml:space="preserve">Attachments</w:t>
+            </w:r>
+          </w:p>
+        </w:tc>
+        <w:tc>
+          <w:tcPr>
+            <w:tcW w:w="2000" w:type="dxa"/>
+            <w:vAlign w:val="center"/>
+          </w:tcPr>
+          <w:p>
+            <w:pPr>
+              <w:spacing w:before="40" w:after="40"/>
+            </w:pPr>
+          </w:p>
+        </w:tc>
+      </w:tr>
+      <w:tr>
+        <w:tc>
+          <w:tcPr>
+            <w:tcW w:w="900" w:type="dxa"/>
+            <w:vAlign w:val="center"/>
+          </w:tcPr>
+          <w:p>
+            <w:pPr>
+              <w:spacing w:before="40" w:after="40"/>
+            </w:pPr>
+            <w:r>
+              <w:rPr>
+                <w:sz w:val="20"/>
+                <w:szCs w:val="20"/>
+              </w:rPr>
+              <w:t xml:space="preserve">8.0</w:t>
+            </w:r>
+          </w:p>
+        </w:tc>
+        <w:tc>
+          <w:tcPr>
+            <w:tcW w:w="7500" w:type="dxa"/>
+            <w:vAlign w:val="center"/>
+          </w:tcPr>
+          <w:p>
+            <w:pPr>
+              <w:spacing w:before="40" w:after="40"/>
+            </w:pPr>
+            <w:r>
+              <w:rPr>
+                <w:sz w:val="20"/>
+                <w:szCs w:val="20"/>
+              </w:rPr>
+              <w:t xml:space="preserve">Revision History</w:t>
+            </w:r>
+          </w:p>
+        </w:tc>
+        <w:tc>
+          <w:tcPr>
+            <w:tcW w:w="2000" w:type="dxa"/>
+            <w:vAlign w:val="center"/>
+          </w:tcPr>
+          <w:p>
+            <w:pPr>
+              <w:spacing w:before="40" w:after="40"/>
+            </w:pPr>
+          </w:p>
+        </w:tc>
+      </w:tr>
+      <w:tr>
+        <w:tc>
+          <w:tcPr>
+            <w:tcW w:w="900" w:type="dxa"/>
+            <w:vAlign w:val="center"/>
+          </w:tcPr>
+          <w:p>
+            <w:pPr>
+              <w:spacing w:before="40" w:after="40"/>
+            </w:pPr>
+            <w:r>
+              <w:rPr>
+                <w:sz w:val="20"/>
+                <w:szCs w:val="20"/>
+              </w:rPr>
+              <w:t xml:space="preserve">9.0</w:t>
+            </w:r>
+          </w:p>
+        </w:tc>
+        <w:tc>
+          <w:tcPr>
+            <w:tcW w:w="7500" w:type="dxa"/>
+            <w:vAlign w:val="center"/>
+          </w:tcPr>
+          <w:p>
+            <w:pPr>
+              <w:spacing w:before="40" w:after="40"/>
+            </w:pPr>
+            <w:r>
+              <w:rPr>
+                <w:sz w:val="20"/>
+                <w:szCs w:val="20"/>
+              </w:rPr>
+              <w:t xml:space="preserve">Approval Page</w:t>
             </w:r>
           </w:p>
         </w:tc>
@@ -1810,7 +2137,7 @@
           <w:sz w:val="24"/>
           <w:szCs w:val="24"/>
         </w:rPr>
-        <w:t xml:space="preserve">1. OBJECTIVE</w:t>
+        <w:t xml:space="preserve">1.0 PURPOSE</w:t>
       </w:r>
     </w:p>
     <w:p>
@@ -1836,7 +2163,7 @@
           <w:sz w:val="24"/>
           <w:szCs w:val="24"/>
         </w:rPr>
-        <w:t xml:space="preserve">2. SCOPE</w:t>
+        <w:t xml:space="preserve">2.0 SCOPE</w:t>
       </w:r>
     </w:p>
     <w:p>
@@ -1862,7 +2189,21 @@
           <w:sz w:val="24"/>
           <w:szCs w:val="24"/>
         </w:rPr>
-        <w:t xml:space="preserve">3. RESPONSIBILITIES</w:t>
+        <w:t xml:space="preserve">3.0 OBSERVATIONS AND RESULTS</w:t>
+      </w:r>
+    </w:p>
+    <w:p>
+      <w:pPr>
+        <w:spacing w:before="200" w:after="80"/>
+      </w:pPr>
+      <w:r>
+        <w:rPr>
+          <w:b/>
+          <w:bCs/>
+          <w:sz w:val="22"/>
+          <w:szCs w:val="22"/>
+        </w:rPr>
+        <w:t xml:space="preserve">3.1 RESPONSIBILITY</w:t>
       </w:r>
     </w:p>
     <w:p>
@@ -1891,16 +2232,42 @@
     </w:p>
     <w:p>
       <w:pPr>
-        <w:spacing w:before="240" w:after="80"/>
+        <w:spacing w:before="200" w:after="80"/>
       </w:pPr>
       <w:r>
         <w:rPr>
           <w:b/>
           <w:bCs/>
-          <w:sz w:val="24"/>
-          <w:szCs w:val="24"/>
+          <w:sz w:val="22"/>
+          <w:szCs w:val="22"/>
         </w:rPr>
-        <w:t xml:space="preserve">4. EQUIPMENT AND SYSTEM DESCRIPTION</w:t>
+        <w:t xml:space="preserve">3.2 ABBREVIATIONS</w:t>
+      </w:r>
+    </w:p>
+    <w:p>
+      <w:pPr>
+        <w:spacing w:before="80" w:after="80"/>
+      </w:pPr>
+      <w:r>
+        <w:rPr>
+          <w:sz w:val="20"/>
+          <w:szCs w:val="20"/>
+        </w:rPr>
+        <w:t xml:space="preserve">{@abbreviationsTableXml}</w:t>
+      </w:r>
+    </w:p>
+    <w:p>
+      <w:pPr>
+        <w:spacing w:before="200" w:after="80"/>
+      </w:pPr>
+      <w:r>
+        <w:rPr>
+          <w:b/>
+          <w:bCs/>
+          <w:sz w:val="22"/>
+          <w:szCs w:val="22"/>
+        </w:rPr>
+        <w:t xml:space="preserve">3.3 EQUIPMENT AND SYSTEM DESCRIPTION</w:t>
       </w:r>
     </w:p>
     <w:p>
@@ -1917,16 +2284,16 @@
     </w:p>
     <w:p>
       <w:pPr>
-        <w:spacing w:before="240" w:after="80"/>
+        <w:spacing w:before="200" w:after="80"/>
       </w:pPr>
       <w:r>
         <w:rPr>
           <w:b/>
           <w:bCs/>
-          <w:sz w:val="24"/>
-          <w:szCs w:val="24"/>
+          <w:sz w:val="22"/>
+          <w:szCs w:val="22"/>
         </w:rPr>
-        <w:t xml:space="preserve">5. QUALIFICATION AND PERIODIC RE-QUALIFICATION HISTORY</w:t>
+        <w:t xml:space="preserve">3.4 QUALIFICATION AND PERIODIC RE-QUALIFICATION HISTORY</w:t>
       </w:r>
     </w:p>
     <w:p>
@@ -1969,16 +2336,16 @@
     </w:p>
     <w:p>
       <w:pPr>
-        <w:spacing w:before="240" w:after="80"/>
+        <w:spacing w:before="200" w:after="80"/>
       </w:pPr>
       <w:r>
         <w:rPr>
           <w:b/>
           <w:bCs/>
-          <w:sz w:val="24"/>
-          <w:szCs w:val="24"/>
+          <w:sz w:val="22"/>
+          <w:szCs w:val="22"/>
         </w:rPr>
-        <w:t xml:space="preserve">6. MEDIA FILL / ASEPTIC PROCESS SIMULATION</w:t>
+        <w:t xml:space="preserve">3.5 MEDIA FILL / ASEPTIC PROCESS SIMULATION</w:t>
       </w:r>
     </w:p>
     <w:p>
@@ -2021,16 +2388,16 @@
     </w:p>
     <w:p>
       <w:pPr>
-        <w:spacing w:before="240" w:after="80"/>
+        <w:spacing w:before="200" w:after="80"/>
       </w:pPr>
       <w:r>
         <w:rPr>
           <w:b/>
           <w:bCs/>
-          <w:sz w:val="24"/>
-          <w:szCs w:val="24"/>
+          <w:sz w:val="22"/>
+          <w:szCs w:val="22"/>
         </w:rPr>
-        <w:t xml:space="preserve">7. MONITORING</w:t>
+        <w:t xml:space="preserve">3.6 MONITORING</w:t>
       </w:r>
     </w:p>
     <w:p>
@@ -2073,16 +2440,16 @@
     </w:p>
     <w:p>
       <w:pPr>
-        <w:spacing w:before="240" w:after="80"/>
+        <w:spacing w:before="200" w:after="80"/>
       </w:pPr>
       <w:r>
         <w:rPr>
           <w:b/>
           <w:bCs/>
-          <w:sz w:val="24"/>
-          <w:szCs w:val="24"/>
+          <w:sz w:val="22"/>
+          <w:szCs w:val="22"/>
         </w:rPr>
-        <w:t xml:space="preserve">8. CALIBRATION OF ASSOCIATED INSTRUMENTS</w:t>
+        <w:t xml:space="preserve">3.7 CALIBRATION OF ASSOCIATED INSTRUMENTS</w:t>
       </w:r>
     </w:p>
     <w:p>
@@ -2125,16 +2492,16 @@
     </w:p>
     <w:p>
       <w:pPr>
-        <w:spacing w:before="240" w:after="80"/>
+        <w:spacing w:before="200" w:after="80"/>
       </w:pPr>
       <w:r>
         <w:rPr>
           <w:b/>
           <w:bCs/>
-          <w:sz w:val="24"/>
-          <w:szCs w:val="24"/>
+          <w:sz w:val="22"/>
+          <w:szCs w:val="22"/>
         </w:rPr>
-        <w:t xml:space="preserve">9. PREVENTIVE MAINTENANCE</w:t>
+        <w:t xml:space="preserve">3.8 PREVENTIVE MAINTENANCE</w:t>
       </w:r>
     </w:p>
     <w:p>
@@ -2177,16 +2544,16 @@
     </w:p>
     <w:p>
       <w:pPr>
-        <w:spacing w:before="240" w:after="80"/>
+        <w:spacing w:before="200" w:after="80"/>
       </w:pPr>
       <w:r>
         <w:rPr>
           <w:b/>
           <w:bCs/>
-          <w:sz w:val="24"/>
-          <w:szCs w:val="24"/>
+          <w:sz w:val="22"/>
+          <w:szCs w:val="22"/>
         </w:rPr>
-        <w:t xml:space="preserve">10. BREAKDOWNS AND TRENDS</w:t>
+        <w:t xml:space="preserve">3.9 BREAKDOWNS AND TRENDS</w:t>
       </w:r>
     </w:p>
     <w:p>
@@ -2215,16 +2582,16 @@
     </w:p>
     <w:p>
       <w:pPr>
-        <w:spacing w:before="240" w:after="80"/>
+        <w:spacing w:before="200" w:after="80"/>
       </w:pPr>
       <w:r>
         <w:rPr>
           <w:b/>
           <w:bCs/>
-          <w:sz w:val="24"/>
-          <w:szCs w:val="24"/>
+          <w:sz w:val="22"/>
+          <w:szCs w:val="22"/>
         </w:rPr>
-        <w:t xml:space="preserve">10.1 BREAKDOWN TREND SUMMARY</w:t>
+        <w:t xml:space="preserve">3.9.1 BREAKDOWN TREND SUMMARY</w:t>
       </w:r>
     </w:p>
     <w:p>
@@ -2241,16 +2608,16 @@
     </w:p>
     <w:p>
       <w:pPr>
-        <w:spacing w:before="240" w:after="80"/>
+        <w:spacing w:before="200" w:after="80"/>
       </w:pPr>
       <w:r>
         <w:rPr>
           <w:b/>
           <w:bCs/>
-          <w:sz w:val="24"/>
-          <w:szCs w:val="24"/>
+          <w:sz w:val="22"/>
+          <w:szCs w:val="22"/>
         </w:rPr>
-        <w:t xml:space="preserve">11. QMS RECORDS SINCE LAST PERIODIC RE-QUALIFICATION</w:t>
+        <w:t xml:space="preserve">3.10 QMS RECORDS SINCE LAST PERIODIC RE-QUALIFICATION</w:t>
       </w:r>
     </w:p>
     <w:p>
@@ -2293,16 +2660,16 @@
     </w:p>
     <w:p>
       <w:pPr>
-        <w:spacing w:before="240" w:after="80"/>
+        <w:spacing w:before="200" w:after="80"/>
       </w:pPr>
       <w:r>
         <w:rPr>
           <w:b/>
           <w:bCs/>
-          <w:sz w:val="24"/>
-          <w:szCs w:val="24"/>
+          <w:sz w:val="22"/>
+          <w:szCs w:val="22"/>
         </w:rPr>
-        <w:t xml:space="preserve">12. ALARM TRENDS</w:t>
+        <w:t xml:space="preserve">3.11 ALARM TRENDS</w:t>
       </w:r>
     </w:p>
     <w:p>
@@ -2345,16 +2712,16 @@
     </w:p>
     <w:p>
       <w:pPr>
-        <w:spacing w:before="240" w:after="80"/>
+        <w:spacing w:before="200" w:after="80"/>
       </w:pPr>
       <w:r>
         <w:rPr>
           <w:b/>
           <w:bCs/>
-          <w:sz w:val="24"/>
-          <w:szCs w:val="24"/>
+          <w:sz w:val="22"/>
+          <w:szCs w:val="22"/>
         </w:rPr>
-        <w:t xml:space="preserve">12.1 ALARM TREND SUMMARY</w:t>
+        <w:t xml:space="preserve">3.11.1 ALARM TREND SUMMARY</w:t>
       </w:r>
     </w:p>
     <w:p>
@@ -2371,16 +2738,16 @@
     </w:p>
     <w:p>
       <w:pPr>
-        <w:spacing w:before="240" w:after="80"/>
+        <w:spacing w:before="200" w:after="80"/>
       </w:pPr>
       <w:r>
         <w:rPr>
           <w:b/>
           <w:bCs/>
-          <w:sz w:val="24"/>
-          <w:szCs w:val="24"/>
+          <w:sz w:val="22"/>
+          <w:szCs w:val="22"/>
         </w:rPr>
-        <w:t xml:space="preserve">13. ACCESS CONTROL AND AUDIT TRAIL REVIEW</w:t>
+        <w:t xml:space="preserve">3.12 ACCESS CONTROL</w:t>
       </w:r>
     </w:p>
     <w:p>
@@ -2394,21 +2761,7 @@
           <w:sz w:val="18"/>
           <w:szCs w:val="18"/>
         </w:rPr>
-        <w:t xml:space="preserve">Complete for every computerized system associated with the equipment. Where the system is shared across several machines on the line, scope the review to this equipment where the system permits and mark the remainder Line-common. State “Not Applicable” explicitly if the equipment has no associated computerized system.</w:t>
-      </w:r>
-    </w:p>
-    <w:p>
-      <w:pPr>
-        <w:spacing w:before="240" w:after="80"/>
-      </w:pPr>
-      <w:r>
-        <w:rPr>
-          <w:b/>
-          <w:bCs/>
-          <w:sz w:val="24"/>
-          <w:szCs w:val="24"/>
-        </w:rPr>
-        <w:t xml:space="preserve">13.1 ACCESS CONTROL</w:t>
+        <w:t xml:space="preserve">Sections 3.12 and 3.13 are completed for every computerized system associated with the equipment. Where the system is shared across several machines on the line, scope the review to this equipment where the system permits and mark the remainder Line-common. State “Not Applicable” explicitly if the equipment has no associated computerized system.</w:t>
       </w:r>
     </w:p>
     <w:p>
@@ -2425,16 +2778,16 @@
     </w:p>
     <w:p>
       <w:pPr>
-        <w:spacing w:before="240" w:after="80"/>
+        <w:spacing w:before="200" w:after="80"/>
       </w:pPr>
       <w:r>
         <w:rPr>
           <w:b/>
           <w:bCs/>
-          <w:sz w:val="24"/>
-          <w:szCs w:val="24"/>
+          <w:sz w:val="22"/>
+          <w:szCs w:val="22"/>
         </w:rPr>
-        <w:t xml:space="preserve">13.2 AUDIT TRAIL REVIEW</w:t>
+        <w:t xml:space="preserve">3.13 AUDIT TRAIL REVIEW</w:t>
       </w:r>
     </w:p>
     <w:p>
@@ -2451,16 +2804,16 @@
     </w:p>
     <w:p>
       <w:pPr>
-        <w:spacing w:before="240" w:after="80"/>
+        <w:spacing w:before="200" w:after="80"/>
       </w:pPr>
       <w:r>
         <w:rPr>
           <w:b/>
           <w:bCs/>
-          <w:sz w:val="24"/>
-          <w:szCs w:val="24"/>
+          <w:sz w:val="22"/>
+          <w:szCs w:val="22"/>
         </w:rPr>
-        <w:t xml:space="preserve">14. COMPUTERIZED SYSTEM VALIDATION STATUS</w:t>
+        <w:t xml:space="preserve">3.14 COMPUTERIZED SYSTEM VALIDATION STATUS</w:t>
       </w:r>
     </w:p>
     <w:p>
@@ -2498,7 +2851,33 @@
           <w:sz w:val="24"/>
           <w:szCs w:val="24"/>
         </w:rPr>
-        <w:t xml:space="preserve">15. CONCLUSION AND RECOMMENDATION</w:t>
+        <w:t xml:space="preserve">4.0 DISCREPANCY / DEVIATIONS (If Any)</w:t>
+      </w:r>
+    </w:p>
+    <w:p>
+      <w:pPr>
+        <w:spacing w:before="80" w:after="80"/>
+      </w:pPr>
+      <w:r>
+        <w:rPr>
+          <w:i/>
+          <w:iCs/>
+          <w:sz w:val="18"/>
+          <w:szCs w:val="18"/>
+        </w:rPr>
+        <w:t xml:space="preserve">Discrepancies observed while compiling this report — a record that could not be located, a reference that did not reconcile, an incomplete data set — with the disposition of each. State explicitly if none were observed.</w:t>
+      </w:r>
+    </w:p>
+    <w:p>
+      <w:pPr>
+        <w:spacing w:before="80" w:after="80"/>
+      </w:pPr>
+      <w:r>
+        <w:rPr>
+          <w:sz w:val="20"/>
+          <w:szCs w:val="20"/>
+        </w:rPr>
+        <w:t xml:space="preserve">{@discrepanciesXml}</w:t>
       </w:r>
     </w:p>
     <w:p>
@@ -2512,7 +2891,7 @@
           <w:sz w:val="24"/>
           <w:szCs w:val="24"/>
         </w:rPr>
-        <w:t xml:space="preserve">15.1 CONCLUSION</w:t>
+        <w:t xml:space="preserve">5.0 SUMMARY AND CONCLUSION</w:t>
       </w:r>
     </w:p>
     <w:p>
@@ -2552,7 +2931,7 @@
           <w:sz w:val="24"/>
           <w:szCs w:val="24"/>
         </w:rPr>
-        <w:t xml:space="preserve">15.2 RECOMMENDATION</w:t>
+        <w:t xml:space="preserve">6.0 RECOMMENDATION</w:t>
       </w:r>
     </w:p>
     <w:p>
@@ -2590,7 +2969,7 @@
           <w:sz w:val="24"/>
           <w:szCs w:val="24"/>
         </w:rPr>
-        <w:t xml:space="preserve">16. ATTACHMENTS</w:t>
+        <w:t xml:space="preserve">7.0 ATTACHMENTS</w:t>
       </w:r>
     </w:p>
     <w:p>
@@ -2616,7 +2995,7 @@
           <w:sz w:val="24"/>
           <w:szCs w:val="24"/>
         </w:rPr>
-        <w:t xml:space="preserve">A. REVISION HISTORY</w:t>
+        <w:t xml:space="preserve">8.0 REVISION HISTORY</w:t>
       </w:r>
     </w:p>
     <w:p>
@@ -2642,7 +3021,19 @@
           <w:sz w:val="24"/>
           <w:szCs w:val="24"/>
         </w:rPr>
-        <w:t xml:space="preserve">B. REVIEW AND APPROVAL</w:t>
+        <w:t xml:space="preserve">9.0 APPROVAL PAGE</w:t>
+      </w:r>
+    </w:p>
+    <w:p>
+      <w:pPr>
+        <w:spacing w:before="80" w:after="80"/>
+      </w:pPr>
+      <w:r>
+        <w:rPr>
+          <w:sz w:val="20"/>
+          <w:szCs w:val="20"/>
+        </w:rPr>
+        <w:t xml:space="preserve">The report has been prepared, reviewed, and approved by the following personnel.</w:t>
       </w:r>
     </w:p>
     <w:tbl>
@@ -2666,11 +3057,9 @@
         </w:tblCellMar>
       </w:tblPr>
       <w:tblGrid>
-        <w:gridCol w:w="2400"/>
-        <w:gridCol w:w="2200"/>
-        <w:gridCol w:w="2400"/>
-        <w:gridCol w:w="1800"/>
-        <w:gridCol w:w="1600"/>
+        <w:gridCol w:w="3400"/>
+        <w:gridCol w:w="3500"/>
+        <w:gridCol w:w="3500"/>
       </w:tblGrid>
       <w:tr>
         <w:trPr>
@@ -2678,7 +3067,7 @@
         </w:trPr>
         <w:tc>
           <w:tcPr>
-            <w:tcW w:w="2400" w:type="dxa"/>
+            <w:tcW w:w="3400" w:type="dxa"/>
             <w:shd w:val="clear" w:color="auto" w:fill="E7E6E6"/>
             <w:vAlign w:val="center"/>
           </w:tcPr>
@@ -2693,13 +3082,13 @@
                 <w:sz w:val="20"/>
                 <w:szCs w:val="20"/>
               </w:rPr>
-              <w:t xml:space="preserve">Role</w:t>
-            </w:r>
-          </w:p>
-        </w:tc>
-        <w:tc>
-          <w:tcPr>
-            <w:tcW w:w="2200" w:type="dxa"/>
+              <w:t xml:space="preserve">Department</w:t>
+            </w:r>
+          </w:p>
+        </w:tc>
+        <w:tc>
+          <w:tcPr>
+            <w:tcW w:w="3500" w:type="dxa"/>
             <w:shd w:val="clear" w:color="auto" w:fill="E7E6E6"/>
             <w:vAlign w:val="center"/>
           </w:tcPr>
@@ -2714,13 +3103,13 @@
                 <w:sz w:val="20"/>
                 <w:szCs w:val="20"/>
               </w:rPr>
-              <w:t xml:space="preserve">Name</w:t>
-            </w:r>
-          </w:p>
-        </w:tc>
-        <w:tc>
-          <w:tcPr>
-            <w:tcW w:w="2400" w:type="dxa"/>
+              <w:t xml:space="preserve">Name and Designation</w:t>
+            </w:r>
+          </w:p>
+        </w:tc>
+        <w:tc>
+          <w:tcPr>
+            <w:tcW w:w="3500" w:type="dxa"/>
             <w:shd w:val="clear" w:color="auto" w:fill="E7E6E6"/>
             <w:vAlign w:val="center"/>
           </w:tcPr>
@@ -2735,49 +3124,7 @@
                 <w:sz w:val="20"/>
                 <w:szCs w:val="20"/>
               </w:rPr>
-              <w:t xml:space="preserve">Designation &amp; Department</w:t>
-            </w:r>
-          </w:p>
-        </w:tc>
-        <w:tc>
-          <w:tcPr>
-            <w:tcW w:w="1800" w:type="dxa"/>
-            <w:shd w:val="clear" w:color="auto" w:fill="E7E6E6"/>
-            <w:vAlign w:val="center"/>
-          </w:tcPr>
-          <w:p>
-            <w:pPr>
-              <w:spacing w:before="40" w:after="40"/>
-            </w:pPr>
-            <w:r>
-              <w:rPr>
-                <w:b/>
-                <w:bCs/>
-                <w:sz w:val="20"/>
-                <w:szCs w:val="20"/>
-              </w:rPr>
-              <w:t xml:space="preserve">Signature</w:t>
-            </w:r>
-          </w:p>
-        </w:tc>
-        <w:tc>
-          <w:tcPr>
-            <w:tcW w:w="1600" w:type="dxa"/>
-            <w:shd w:val="clear" w:color="auto" w:fill="E7E6E6"/>
-            <w:vAlign w:val="center"/>
-          </w:tcPr>
-          <w:p>
-            <w:pPr>
-              <w:spacing w:before="40" w:after="40"/>
-            </w:pPr>
-            <w:r>
-              <w:rPr>
-                <w:b/>
-                <w:bCs/>
-                <w:sz w:val="20"/>
-                <w:szCs w:val="20"/>
-              </w:rPr>
-              <w:t xml:space="preserve">Date</w:t>
+              <w:t xml:space="preserve">Sign &amp; date</w:t>
             </w:r>
           </w:p>
         </w:tc>
@@ -2785,58 +3132,36 @@
       <w:tr>
         <w:tc>
           <w:tcPr>
-            <w:tcW w:w="2400" w:type="dxa"/>
-            <w:vAlign w:val="center"/>
-          </w:tcPr>
-          <w:p>
-            <w:pPr>
-              <w:spacing w:before="40" w:after="40"/>
-            </w:pPr>
-            <w:r>
-              <w:rPr>
-                <w:sz w:val="20"/>
-                <w:szCs w:val="20"/>
-              </w:rPr>
-              <w:t xml:space="preserve">Prepared By (Quality Assurance)</w:t>
-            </w:r>
-          </w:p>
-        </w:tc>
-        <w:tc>
-          <w:tcPr>
-            <w:tcW w:w="2200" w:type="dxa"/>
-            <w:vAlign w:val="center"/>
-          </w:tcPr>
-          <w:p>
-            <w:pPr>
-              <w:spacing w:before="40" w:after="40"/>
-            </w:pPr>
-          </w:p>
-        </w:tc>
-        <w:tc>
-          <w:tcPr>
-            <w:tcW w:w="2400" w:type="dxa"/>
-            <w:vAlign w:val="center"/>
-          </w:tcPr>
-          <w:p>
-            <w:pPr>
-              <w:spacing w:before="40" w:after="40"/>
-            </w:pPr>
-          </w:p>
-        </w:tc>
-        <w:tc>
-          <w:tcPr>
-            <w:tcW w:w="1800" w:type="dxa"/>
-            <w:vAlign w:val="center"/>
-          </w:tcPr>
-          <w:p>
-            <w:pPr>
-              <w:spacing w:before="40" w:after="40"/>
-            </w:pPr>
-          </w:p>
-        </w:tc>
-        <w:tc>
-          <w:tcPr>
-            <w:tcW w:w="1600" w:type="dxa"/>
+            <w:tcW w:w="3400" w:type="dxa"/>
+            <w:vAlign w:val="center"/>
+          </w:tcPr>
+          <w:p>
+            <w:pPr>
+              <w:spacing w:before="40" w:after="40"/>
+            </w:pPr>
+            <w:r>
+              <w:rPr>
+                <w:sz w:val="20"/>
+                <w:szCs w:val="20"/>
+              </w:rPr>
+              <w:t xml:space="preserve">Prepared By</w:t>
+            </w:r>
+          </w:p>
+        </w:tc>
+        <w:tc>
+          <w:tcPr>
+            <w:tcW w:w="3500" w:type="dxa"/>
+            <w:vAlign w:val="center"/>
+          </w:tcPr>
+          <w:p>
+            <w:pPr>
+              <w:spacing w:before="40" w:after="40"/>
+            </w:pPr>
+          </w:p>
+        </w:tc>
+        <w:tc>
+          <w:tcPr>
+            <w:tcW w:w="3500" w:type="dxa"/>
             <w:vAlign w:val="center"/>
           </w:tcPr>
           <w:p>
@@ -2849,58 +3174,36 @@
       <w:tr>
         <w:tc>
           <w:tcPr>
-            <w:tcW w:w="2400" w:type="dxa"/>
-            <w:vAlign w:val="center"/>
-          </w:tcPr>
-          <w:p>
-            <w:pPr>
-              <w:spacing w:before="40" w:after="40"/>
-            </w:pPr>
-            <w:r>
-              <w:rPr>
-                <w:sz w:val="20"/>
-                <w:szCs w:val="20"/>
-              </w:rPr>
-              <w:t xml:space="preserve">Reviewed By (Production Head / Designee)</w:t>
-            </w:r>
-          </w:p>
-        </w:tc>
-        <w:tc>
-          <w:tcPr>
-            <w:tcW w:w="2200" w:type="dxa"/>
-            <w:vAlign w:val="center"/>
-          </w:tcPr>
-          <w:p>
-            <w:pPr>
-              <w:spacing w:before="40" w:after="40"/>
-            </w:pPr>
-          </w:p>
-        </w:tc>
-        <w:tc>
-          <w:tcPr>
-            <w:tcW w:w="2400" w:type="dxa"/>
-            <w:vAlign w:val="center"/>
-          </w:tcPr>
-          <w:p>
-            <w:pPr>
-              <w:spacing w:before="40" w:after="40"/>
-            </w:pPr>
-          </w:p>
-        </w:tc>
-        <w:tc>
-          <w:tcPr>
-            <w:tcW w:w="1800" w:type="dxa"/>
-            <w:vAlign w:val="center"/>
-          </w:tcPr>
-          <w:p>
-            <w:pPr>
-              <w:spacing w:before="40" w:after="40"/>
-            </w:pPr>
-          </w:p>
-        </w:tc>
-        <w:tc>
-          <w:tcPr>
-            <w:tcW w:w="1600" w:type="dxa"/>
+            <w:tcW w:w="3400" w:type="dxa"/>
+            <w:vAlign w:val="center"/>
+          </w:tcPr>
+          <w:p>
+            <w:pPr>
+              <w:spacing w:before="40" w:after="40"/>
+            </w:pPr>
+            <w:r>
+              <w:rPr>
+                <w:sz w:val="20"/>
+                <w:szCs w:val="20"/>
+              </w:rPr>
+              <w:t xml:space="preserve">Quality Assurance</w:t>
+            </w:r>
+          </w:p>
+        </w:tc>
+        <w:tc>
+          <w:tcPr>
+            <w:tcW w:w="3500" w:type="dxa"/>
+            <w:vAlign w:val="center"/>
+          </w:tcPr>
+          <w:p>
+            <w:pPr>
+              <w:spacing w:before="40" w:after="40"/>
+            </w:pPr>
+          </w:p>
+        </w:tc>
+        <w:tc>
+          <w:tcPr>
+            <w:tcW w:w="3500" w:type="dxa"/>
             <w:vAlign w:val="center"/>
           </w:tcPr>
           <w:p>
@@ -2913,58 +3216,36 @@
       <w:tr>
         <w:tc>
           <w:tcPr>
-            <w:tcW w:w="2400" w:type="dxa"/>
-            <w:vAlign w:val="center"/>
-          </w:tcPr>
-          <w:p>
-            <w:pPr>
-              <w:spacing w:before="40" w:after="40"/>
-            </w:pPr>
-            <w:r>
-              <w:rPr>
-                <w:sz w:val="20"/>
-                <w:szCs w:val="20"/>
-              </w:rPr>
-              <w:t xml:space="preserve">Reviewed By (Engineering and Utilities Head / Designee)</w:t>
-            </w:r>
-          </w:p>
-        </w:tc>
-        <w:tc>
-          <w:tcPr>
-            <w:tcW w:w="2200" w:type="dxa"/>
-            <w:vAlign w:val="center"/>
-          </w:tcPr>
-          <w:p>
-            <w:pPr>
-              <w:spacing w:before="40" w:after="40"/>
-            </w:pPr>
-          </w:p>
-        </w:tc>
-        <w:tc>
-          <w:tcPr>
-            <w:tcW w:w="2400" w:type="dxa"/>
-            <w:vAlign w:val="center"/>
-          </w:tcPr>
-          <w:p>
-            <w:pPr>
-              <w:spacing w:before="40" w:after="40"/>
-            </w:pPr>
-          </w:p>
-        </w:tc>
-        <w:tc>
-          <w:tcPr>
-            <w:tcW w:w="1800" w:type="dxa"/>
-            <w:vAlign w:val="center"/>
-          </w:tcPr>
-          <w:p>
-            <w:pPr>
-              <w:spacing w:before="40" w:after="40"/>
-            </w:pPr>
-          </w:p>
-        </w:tc>
-        <w:tc>
-          <w:tcPr>
-            <w:tcW w:w="1600" w:type="dxa"/>
+            <w:tcW w:w="3400" w:type="dxa"/>
+            <w:vAlign w:val="center"/>
+          </w:tcPr>
+          <w:p>
+            <w:pPr>
+              <w:spacing w:before="40" w:after="40"/>
+            </w:pPr>
+            <w:r>
+              <w:rPr>
+                <w:sz w:val="20"/>
+                <w:szCs w:val="20"/>
+              </w:rPr>
+              <w:t xml:space="preserve">Reviewed By</w:t>
+            </w:r>
+          </w:p>
+        </w:tc>
+        <w:tc>
+          <w:tcPr>
+            <w:tcW w:w="3500" w:type="dxa"/>
+            <w:vAlign w:val="center"/>
+          </w:tcPr>
+          <w:p>
+            <w:pPr>
+              <w:spacing w:before="40" w:after="40"/>
+            </w:pPr>
+          </w:p>
+        </w:tc>
+        <w:tc>
+          <w:tcPr>
+            <w:tcW w:w="3500" w:type="dxa"/>
             <w:vAlign w:val="center"/>
           </w:tcPr>
           <w:p>
@@ -2977,58 +3258,36 @@
       <w:tr>
         <w:tc>
           <w:tcPr>
-            <w:tcW w:w="2400" w:type="dxa"/>
-            <w:vAlign w:val="center"/>
-          </w:tcPr>
-          <w:p>
-            <w:pPr>
-              <w:spacing w:before="40" w:after="40"/>
-            </w:pPr>
-            <w:r>
-              <w:rPr>
-                <w:sz w:val="20"/>
-                <w:szCs w:val="20"/>
-              </w:rPr>
-              <w:t xml:space="preserve">Reviewed By (Quality Assurance Head / Designee)</w:t>
-            </w:r>
-          </w:p>
-        </w:tc>
-        <w:tc>
-          <w:tcPr>
-            <w:tcW w:w="2200" w:type="dxa"/>
-            <w:vAlign w:val="center"/>
-          </w:tcPr>
-          <w:p>
-            <w:pPr>
-              <w:spacing w:before="40" w:after="40"/>
-            </w:pPr>
-          </w:p>
-        </w:tc>
-        <w:tc>
-          <w:tcPr>
-            <w:tcW w:w="2400" w:type="dxa"/>
-            <w:vAlign w:val="center"/>
-          </w:tcPr>
-          <w:p>
-            <w:pPr>
-              <w:spacing w:before="40" w:after="40"/>
-            </w:pPr>
-          </w:p>
-        </w:tc>
-        <w:tc>
-          <w:tcPr>
-            <w:tcW w:w="1800" w:type="dxa"/>
-            <w:vAlign w:val="center"/>
-          </w:tcPr>
-          <w:p>
-            <w:pPr>
-              <w:spacing w:before="40" w:after="40"/>
-            </w:pPr>
-          </w:p>
-        </w:tc>
-        <w:tc>
-          <w:tcPr>
-            <w:tcW w:w="1600" w:type="dxa"/>
+            <w:tcW w:w="3400" w:type="dxa"/>
+            <w:vAlign w:val="center"/>
+          </w:tcPr>
+          <w:p>
+            <w:pPr>
+              <w:spacing w:before="40" w:after="40"/>
+            </w:pPr>
+            <w:r>
+              <w:rPr>
+                <w:sz w:val="20"/>
+                <w:szCs w:val="20"/>
+              </w:rPr>
+              <w:t xml:space="preserve">Production Head / Designee</w:t>
+            </w:r>
+          </w:p>
+        </w:tc>
+        <w:tc>
+          <w:tcPr>
+            <w:tcW w:w="3500" w:type="dxa"/>
+            <w:vAlign w:val="center"/>
+          </w:tcPr>
+          <w:p>
+            <w:pPr>
+              <w:spacing w:before="40" w:after="40"/>
+            </w:pPr>
+          </w:p>
+        </w:tc>
+        <w:tc>
+          <w:tcPr>
+            <w:tcW w:w="3500" w:type="dxa"/>
             <w:vAlign w:val="center"/>
           </w:tcPr>
           <w:p>
@@ -3041,58 +3300,162 @@
       <w:tr>
         <w:tc>
           <w:tcPr>
-            <w:tcW w:w="2400" w:type="dxa"/>
-            <w:vAlign w:val="center"/>
-          </w:tcPr>
-          <w:p>
-            <w:pPr>
-              <w:spacing w:before="40" w:after="40"/>
-            </w:pPr>
-            <w:r>
-              <w:rPr>
-                <w:sz w:val="20"/>
-                <w:szCs w:val="20"/>
-              </w:rPr>
-              <w:t xml:space="preserve">Approved By (Head QA / Designee)</w:t>
-            </w:r>
-          </w:p>
-        </w:tc>
-        <w:tc>
-          <w:tcPr>
-            <w:tcW w:w="2200" w:type="dxa"/>
-            <w:vAlign w:val="center"/>
-          </w:tcPr>
-          <w:p>
-            <w:pPr>
-              <w:spacing w:before="40" w:after="40"/>
-            </w:pPr>
-          </w:p>
-        </w:tc>
-        <w:tc>
-          <w:tcPr>
-            <w:tcW w:w="2400" w:type="dxa"/>
-            <w:vAlign w:val="center"/>
-          </w:tcPr>
-          <w:p>
-            <w:pPr>
-              <w:spacing w:before="40" w:after="40"/>
-            </w:pPr>
-          </w:p>
-        </w:tc>
-        <w:tc>
-          <w:tcPr>
-            <w:tcW w:w="1800" w:type="dxa"/>
-            <w:vAlign w:val="center"/>
-          </w:tcPr>
-          <w:p>
-            <w:pPr>
-              <w:spacing w:before="40" w:after="40"/>
-            </w:pPr>
-          </w:p>
-        </w:tc>
-        <w:tc>
-          <w:tcPr>
-            <w:tcW w:w="1600" w:type="dxa"/>
+            <w:tcW w:w="3400" w:type="dxa"/>
+            <w:vAlign w:val="center"/>
+          </w:tcPr>
+          <w:p>
+            <w:pPr>
+              <w:spacing w:before="40" w:after="40"/>
+            </w:pPr>
+            <w:r>
+              <w:rPr>
+                <w:sz w:val="20"/>
+                <w:szCs w:val="20"/>
+              </w:rPr>
+              <w:t xml:space="preserve">Engineering and Utilities Head / Designee</w:t>
+            </w:r>
+          </w:p>
+        </w:tc>
+        <w:tc>
+          <w:tcPr>
+            <w:tcW w:w="3500" w:type="dxa"/>
+            <w:vAlign w:val="center"/>
+          </w:tcPr>
+          <w:p>
+            <w:pPr>
+              <w:spacing w:before="40" w:after="40"/>
+            </w:pPr>
+          </w:p>
+        </w:tc>
+        <w:tc>
+          <w:tcPr>
+            <w:tcW w:w="3500" w:type="dxa"/>
+            <w:vAlign w:val="center"/>
+          </w:tcPr>
+          <w:p>
+            <w:pPr>
+              <w:spacing w:before="40" w:after="40"/>
+            </w:pPr>
+          </w:p>
+        </w:tc>
+      </w:tr>
+      <w:tr>
+        <w:tc>
+          <w:tcPr>
+            <w:tcW w:w="3400" w:type="dxa"/>
+            <w:vAlign w:val="center"/>
+          </w:tcPr>
+          <w:p>
+            <w:pPr>
+              <w:spacing w:before="40" w:after="40"/>
+            </w:pPr>
+            <w:r>
+              <w:rPr>
+                <w:sz w:val="20"/>
+                <w:szCs w:val="20"/>
+              </w:rPr>
+              <w:t xml:space="preserve">Quality Assurance Head / Designee</w:t>
+            </w:r>
+          </w:p>
+        </w:tc>
+        <w:tc>
+          <w:tcPr>
+            <w:tcW w:w="3500" w:type="dxa"/>
+            <w:vAlign w:val="center"/>
+          </w:tcPr>
+          <w:p>
+            <w:pPr>
+              <w:spacing w:before="40" w:after="40"/>
+            </w:pPr>
+          </w:p>
+        </w:tc>
+        <w:tc>
+          <w:tcPr>
+            <w:tcW w:w="3500" w:type="dxa"/>
+            <w:vAlign w:val="center"/>
+          </w:tcPr>
+          <w:p>
+            <w:pPr>
+              <w:spacing w:before="40" w:after="40"/>
+            </w:pPr>
+          </w:p>
+        </w:tc>
+      </w:tr>
+      <w:tr>
+        <w:tc>
+          <w:tcPr>
+            <w:tcW w:w="3400" w:type="dxa"/>
+            <w:vAlign w:val="center"/>
+          </w:tcPr>
+          <w:p>
+            <w:pPr>
+              <w:spacing w:before="40" w:after="40"/>
+            </w:pPr>
+            <w:r>
+              <w:rPr>
+                <w:sz w:val="20"/>
+                <w:szCs w:val="20"/>
+              </w:rPr>
+              <w:t xml:space="preserve">Approved By</w:t>
+            </w:r>
+          </w:p>
+        </w:tc>
+        <w:tc>
+          <w:tcPr>
+            <w:tcW w:w="3500" w:type="dxa"/>
+            <w:vAlign w:val="center"/>
+          </w:tcPr>
+          <w:p>
+            <w:pPr>
+              <w:spacing w:before="40" w:after="40"/>
+            </w:pPr>
+          </w:p>
+        </w:tc>
+        <w:tc>
+          <w:tcPr>
+            <w:tcW w:w="3500" w:type="dxa"/>
+            <w:vAlign w:val="center"/>
+          </w:tcPr>
+          <w:p>
+            <w:pPr>
+              <w:spacing w:before="40" w:after="40"/>
+            </w:pPr>
+          </w:p>
+        </w:tc>
+      </w:tr>
+      <w:tr>
+        <w:tc>
+          <w:tcPr>
+            <w:tcW w:w="3400" w:type="dxa"/>
+            <w:vAlign w:val="center"/>
+          </w:tcPr>
+          <w:p>
+            <w:pPr>
+              <w:spacing w:before="40" w:after="40"/>
+            </w:pPr>
+            <w:r>
+              <w:rPr>
+                <w:sz w:val="20"/>
+                <w:szCs w:val="20"/>
+              </w:rPr>
+              <w:t xml:space="preserve">Head - QA / Designee</w:t>
+            </w:r>
+          </w:p>
+        </w:tc>
+        <w:tc>
+          <w:tcPr>
+            <w:tcW w:w="3500" w:type="dxa"/>
+            <w:vAlign w:val="center"/>
+          </w:tcPr>
+          <w:p>
+            <w:pPr>
+              <w:spacing w:before="40" w:after="40"/>
+            </w:pPr>
+          </w:p>
+        </w:tc>
+        <w:tc>
+          <w:tcPr>
+            <w:tcW w:w="3500" w:type="dxa"/>
             <w:vAlign w:val="center"/>
           </w:tcPr>
           <w:p>

</xml_diff>